<commit_message>
docs: add the GitHub repository URL to the report
Replaces the repository placeholder on the cover page with the published repository address.
</commit_message>
<xml_diff>
--- a/report/PROG2002_A3_Report.docx
+++ b/report/PROG2002_A3_Report.docx
@@ -199,7 +199,7 @@
           <w:color w:val="1f2937"/>
           <w:sz w:val="22"/>
         </w:rPr>
-        <w:t xml:space="preserve"> GitHub repository: [GitHub repository URL]</w:t>
+        <w:t xml:space="preserve"> GitHub repository: https://github.com/Momogan6/charity-events-a3</w:t>
       </w:r>
       <w:r>
         <w:br w:type="textWrapping"/>
@@ -246,141 +246,6 @@
           <w:b w:val="1"/>
         </w:rPr>
         <w:t>目录</w:t>
-      </w:r>
-    </w:p>
-    <w:p>
-      <w:pPr>
-        <w:pStyle w:val="000001"/>
-        <w:tabs>
-          <w:tab w:val="right" w:leader="dot" w:pos="9072"/>
-        </w:tabs>
-        <w:ind w:left="0"/>
-      </w:pPr>
-      <w:r>
-        <w:fldChar w:fldCharType="begin" w:fldLock="0" w:dirty="0"/>
-      </w:r>
-      <w:r>
-        <w:instrText xml:space="preserve"> TOC \o "1-2" \h \z \u </w:instrText>
-      </w:r>
-      <w:r>
-        <w:fldChar w:fldCharType="separate" w:fldLock="0" w:dirty="0"/>
-      </w:r>
-      <w:r>
-        <w:fldChar w:fldCharType="begin" w:fldLock="0" w:dirty="0"/>
-      </w:r>
-      <w:r>
-        <w:instrText xml:space="preserve"> HYPERLINK \l "section-1" </w:instrText>
-      </w:r>
-      <w:r>
-        <w:fldChar w:fldCharType="separate" w:fldLock="0" w:dirty="0"/>
-      </w:r>
-      <w:r>
-        <w:t>1. Introduction and Case Study</w:t>
-      </w:r>
-      <w:r>
-        <w:fldChar w:fldCharType="end" w:fldLock="0" w:dirty="0"/>
-      </w:r>
-      <w:r>
-        <w:tab/>
-      </w:r>
-      <w:r>
-        <w:fldChar w:fldCharType="begin" w:fldLock="0" w:dirty="0"/>
-      </w:r>
-      <w:r>
-        <w:instrText xml:space="preserve"> PAGEREF section-1 \h </w:instrText>
-      </w:r>
-      <w:r>
-        <w:fldChar w:fldCharType="separate" w:fldLock="0" w:dirty="0"/>
-      </w:r>
-      <w:r>
-        <w:t>1</w:t>
-      </w:r>
-      <w:r>
-        <w:fldChar w:fldCharType="end" w:fldLock="0" w:dirty="0"/>
-      </w:r>
-    </w:p>
-    <w:p>
-      <w:pPr>
-        <w:pStyle w:val="000001"/>
-        <w:tabs>
-          <w:tab w:val="right" w:leader="dot" w:pos="9072"/>
-        </w:tabs>
-        <w:ind w:left="0"/>
-      </w:pPr>
-      <w:r>
-        <w:fldChar w:fldCharType="begin" w:fldLock="0" w:dirty="0"/>
-      </w:r>
-      <w:r>
-        <w:instrText xml:space="preserve"> HYPERLINK \l "section-2" </w:instrText>
-      </w:r>
-      <w:r>
-        <w:fldChar w:fldCharType="separate" w:fldLock="0" w:dirty="0"/>
-      </w:r>
-      <w:r>
-        <w:t>2. Technology Stack</w:t>
-      </w:r>
-      <w:r>
-        <w:fldChar w:fldCharType="end" w:fldLock="0" w:dirty="0"/>
-      </w:r>
-      <w:r>
-        <w:tab/>
-      </w:r>
-      <w:r>
-        <w:fldChar w:fldCharType="begin" w:fldLock="0" w:dirty="0"/>
-      </w:r>
-      <w:r>
-        <w:instrText xml:space="preserve"> PAGEREF section-2 \h </w:instrText>
-      </w:r>
-      <w:r>
-        <w:fldChar w:fldCharType="separate" w:fldLock="0" w:dirty="0"/>
-      </w:r>
-      <w:r>
-        <w:t>1</w:t>
-      </w:r>
-      <w:r>
-        <w:fldChar w:fldCharType="end" w:fldLock="0" w:dirty="0"/>
-      </w:r>
-    </w:p>
-    <w:p>
-      <w:pPr>
-        <w:pStyle w:val="000001"/>
-        <w:tabs>
-          <w:tab w:val="right" w:leader="dot" w:pos="9072"/>
-        </w:tabs>
-        <w:ind w:left="0"/>
-      </w:pPr>
-      <w:r>
-        <w:fldChar w:fldCharType="begin" w:fldLock="0" w:dirty="0"/>
-      </w:r>
-      <w:r>
-        <w:instrText xml:space="preserve"> HYPERLINK \l "section-3" </w:instrText>
-      </w:r>
-      <w:r>
-        <w:fldChar w:fldCharType="separate" w:fldLock="0" w:dirty="0"/>
-      </w:r>
-      <w:r>
-        <w:t>3. Database Design (Part 1)</w:t>
-      </w:r>
-      <w:r>
-        <w:fldChar w:fldCharType="end" w:fldLock="0" w:dirty="0"/>
-      </w:r>
-      <w:r>
-        <w:tab/>
-      </w:r>
-      <w:r>
-        <w:fldChar w:fldCharType="begin" w:fldLock="0" w:dirty="0"/>
-      </w:r>
-      <w:r>
-        <w:instrText xml:space="preserve"> PAGEREF section-3 \h </w:instrText>
-      </w:r>
-      <w:r>
-        <w:fldChar w:fldCharType="separate" w:fldLock="0" w:dirty="0"/>
-      </w:r>
-      <w:r>
-        <w:t>1</w:t>
-      </w:r>
-      <w:r>
-        <w:fldChar w:fldCharType="end" w:fldLock="0" w:dirty="0"/>
       </w:r>
     </w:p>
     <w:p>
@@ -389,19 +254,28 @@
         <w:tabs>
           <w:tab w:val="right" w:leader="dot" w:pos="9072"/>
         </w:tabs>
-        <w:ind w:left="200"/>
+        <w:ind w:left="0"/>
       </w:pPr>
       <w:r>
         <w:fldChar w:fldCharType="begin" w:fldLock="0" w:dirty="0"/>
       </w:r>
       <w:r>
-        <w:instrText xml:space="preserve"> HYPERLINK \l "section-3-1" </w:instrText>
+        <w:instrText xml:space="preserve"> TOC \o "1-2" \h \z \u </w:instrText>
       </w:r>
       <w:r>
         <w:fldChar w:fldCharType="separate" w:fldLock="0" w:dirty="0"/>
       </w:r>
       <w:r>
-        <w:t>3.1 Schema analysis and update</w:t>
+        <w:fldChar w:fldCharType="begin" w:fldLock="0" w:dirty="0"/>
+      </w:r>
+      <w:r>
+        <w:instrText xml:space="preserve"> HYPERLINK \l "section-1" </w:instrText>
+      </w:r>
+      <w:r>
+        <w:fldChar w:fldCharType="separate" w:fldLock="0" w:dirty="0"/>
+      </w:r>
+      <w:r>
+        <w:t>1. Introduction and Case Study</w:t>
       </w:r>
       <w:r>
         <w:fldChar w:fldCharType="end" w:fldLock="0" w:dirty="0"/>
@@ -413,7 +287,7 @@
         <w:fldChar w:fldCharType="begin" w:fldLock="0" w:dirty="0"/>
       </w:r>
       <w:r>
-        <w:instrText xml:space="preserve"> PAGEREF section-3-1 \h </w:instrText>
+        <w:instrText xml:space="preserve"> PAGEREF section-1 \h </w:instrText>
       </w:r>
       <w:r>
         <w:fldChar w:fldCharType="separate" w:fldLock="0" w:dirty="0"/>
@@ -431,19 +305,19 @@
         <w:tabs>
           <w:tab w:val="right" w:leader="dot" w:pos="9072"/>
         </w:tabs>
-        <w:ind w:left="200"/>
+        <w:ind w:left="0"/>
       </w:pPr>
       <w:r>
         <w:fldChar w:fldCharType="begin" w:fldLock="0" w:dirty="0"/>
       </w:r>
       <w:r>
-        <w:instrText xml:space="preserve"> HYPERLINK \l "section-3-2" </w:instrText>
+        <w:instrText xml:space="preserve"> HYPERLINK \l "section-2" </w:instrText>
       </w:r>
       <w:r>
         <w:fldChar w:fldCharType="separate" w:fldLock="0" w:dirty="0"/>
       </w:r>
       <w:r>
-        <w:t>3.2 How the required relationships are enforced</w:t>
+        <w:t>2. Technology Stack</w:t>
       </w:r>
       <w:r>
         <w:fldChar w:fldCharType="end" w:fldLock="0" w:dirty="0"/>
@@ -455,7 +329,7 @@
         <w:fldChar w:fldCharType="begin" w:fldLock="0" w:dirty="0"/>
       </w:r>
       <w:r>
-        <w:instrText xml:space="preserve"> PAGEREF section-3-2 \h </w:instrText>
+        <w:instrText xml:space="preserve"> PAGEREF section-2 \h </w:instrText>
       </w:r>
       <w:r>
         <w:fldChar w:fldCharType="separate" w:fldLock="0" w:dirty="0"/>
@@ -473,12 +347,138 @@
         <w:tabs>
           <w:tab w:val="right" w:leader="dot" w:pos="9072"/>
         </w:tabs>
+        <w:ind w:left="0"/>
+      </w:pPr>
+      <w:r>
+        <w:fldChar w:fldCharType="begin" w:fldLock="0" w:dirty="0"/>
+      </w:r>
+      <w:r>
+        <w:instrText xml:space="preserve"> HYPERLINK \l "section-3" </w:instrText>
+      </w:r>
+      <w:r>
+        <w:fldChar w:fldCharType="separate" w:fldLock="0" w:dirty="0"/>
+      </w:r>
+      <w:r>
+        <w:t>3. Database Design (Part 1)</w:t>
+      </w:r>
+      <w:r>
+        <w:fldChar w:fldCharType="end" w:fldLock="0" w:dirty="0"/>
+      </w:r>
+      <w:r>
+        <w:tab/>
+      </w:r>
+      <w:r>
+        <w:fldChar w:fldCharType="begin" w:fldLock="0" w:dirty="0"/>
+      </w:r>
+      <w:r>
+        <w:instrText xml:space="preserve"> PAGEREF section-3 \h </w:instrText>
+      </w:r>
+      <w:r>
+        <w:fldChar w:fldCharType="separate" w:fldLock="0" w:dirty="0"/>
+      </w:r>
+      <w:r>
+        <w:t>1</w:t>
+      </w:r>
+      <w:r>
+        <w:fldChar w:fldCharType="end" w:fldLock="0" w:dirty="0"/>
+      </w:r>
+    </w:p>
+    <w:p>
+      <w:pPr>
+        <w:pStyle w:val="000005"/>
+        <w:tabs>
+          <w:tab w:val="right" w:leader="dot" w:pos="9072"/>
+        </w:tabs>
         <w:ind w:left="200"/>
       </w:pPr>
       <w:r>
         <w:fldChar w:fldCharType="begin" w:fldLock="0" w:dirty="0"/>
       </w:r>
       <w:r>
+        <w:instrText xml:space="preserve"> HYPERLINK \l "section-3-1" </w:instrText>
+      </w:r>
+      <w:r>
+        <w:fldChar w:fldCharType="separate" w:fldLock="0" w:dirty="0"/>
+      </w:r>
+      <w:r>
+        <w:t>3.1 Schema analysis and update</w:t>
+      </w:r>
+      <w:r>
+        <w:fldChar w:fldCharType="end" w:fldLock="0" w:dirty="0"/>
+      </w:r>
+      <w:r>
+        <w:tab/>
+      </w:r>
+      <w:r>
+        <w:fldChar w:fldCharType="begin" w:fldLock="0" w:dirty="0"/>
+      </w:r>
+      <w:r>
+        <w:instrText xml:space="preserve"> PAGEREF section-3-1 \h </w:instrText>
+      </w:r>
+      <w:r>
+        <w:fldChar w:fldCharType="separate" w:fldLock="0" w:dirty="0"/>
+      </w:r>
+      <w:r>
+        <w:t>1</w:t>
+      </w:r>
+      <w:r>
+        <w:fldChar w:fldCharType="end" w:fldLock="0" w:dirty="0"/>
+      </w:r>
+    </w:p>
+    <w:p>
+      <w:pPr>
+        <w:pStyle w:val="000005"/>
+        <w:tabs>
+          <w:tab w:val="right" w:leader="dot" w:pos="9072"/>
+        </w:tabs>
+        <w:ind w:left="200"/>
+      </w:pPr>
+      <w:r>
+        <w:fldChar w:fldCharType="begin" w:fldLock="0" w:dirty="0"/>
+      </w:r>
+      <w:r>
+        <w:instrText xml:space="preserve"> HYPERLINK \l "section-3-2" </w:instrText>
+      </w:r>
+      <w:r>
+        <w:fldChar w:fldCharType="separate" w:fldLock="0" w:dirty="0"/>
+      </w:r>
+      <w:r>
+        <w:t>3.2 How the required relationships are enforced</w:t>
+      </w:r>
+      <w:r>
+        <w:fldChar w:fldCharType="end" w:fldLock="0" w:dirty="0"/>
+      </w:r>
+      <w:r>
+        <w:tab/>
+      </w:r>
+      <w:r>
+        <w:fldChar w:fldCharType="begin" w:fldLock="0" w:dirty="0"/>
+      </w:r>
+      <w:r>
+        <w:instrText xml:space="preserve"> PAGEREF section-3-2 \h </w:instrText>
+      </w:r>
+      <w:r>
+        <w:fldChar w:fldCharType="separate" w:fldLock="0" w:dirty="0"/>
+      </w:r>
+      <w:r>
+        <w:t>1</w:t>
+      </w:r>
+      <w:r>
+        <w:fldChar w:fldCharType="end" w:fldLock="0" w:dirty="0"/>
+      </w:r>
+    </w:p>
+    <w:p>
+      <w:pPr>
+        <w:pStyle w:val="000005"/>
+        <w:tabs>
+          <w:tab w:val="right" w:leader="dot" w:pos="9072"/>
+        </w:tabs>
+        <w:ind w:left="200"/>
+      </w:pPr>
+      <w:r>
+        <w:fldChar w:fldCharType="begin" w:fldLock="0" w:dirty="0"/>
+      </w:r>
+      <w:r>
         <w:instrText xml:space="preserve"> HYPERLINK \l "section-3-3" </w:instrText>
       </w:r>
       <w:r>
@@ -498,6 +498,90 @@
       </w:r>
       <w:r>
         <w:instrText xml:space="preserve"> PAGEREF section-3-3 \h </w:instrText>
+      </w:r>
+      <w:r>
+        <w:fldChar w:fldCharType="separate" w:fldLock="0" w:dirty="0"/>
+      </w:r>
+      <w:r>
+        <w:t>1</w:t>
+      </w:r>
+      <w:r>
+        <w:fldChar w:fldCharType="end" w:fldLock="0" w:dirty="0"/>
+      </w:r>
+    </w:p>
+    <w:p>
+      <w:pPr>
+        <w:pStyle w:val="000005"/>
+        <w:tabs>
+          <w:tab w:val="right" w:leader="dot" w:pos="9072"/>
+        </w:tabs>
+        <w:ind w:left="200"/>
+      </w:pPr>
+      <w:r>
+        <w:fldChar w:fldCharType="begin" w:fldLock="0" w:dirty="0"/>
+      </w:r>
+      <w:r>
+        <w:instrText xml:space="preserve"> HYPERLINK \l "section-3-4" </w:instrText>
+      </w:r>
+      <w:r>
+        <w:fldChar w:fldCharType="separate" w:fldLock="0" w:dirty="0"/>
+      </w:r>
+      <w:r>
+        <w:t>3.4 Trigger: business rules that cannot be bypassed</w:t>
+      </w:r>
+      <w:r>
+        <w:fldChar w:fldCharType="end" w:fldLock="0" w:dirty="0"/>
+      </w:r>
+      <w:r>
+        <w:tab/>
+      </w:r>
+      <w:r>
+        <w:fldChar w:fldCharType="begin" w:fldLock="0" w:dirty="0"/>
+      </w:r>
+      <w:r>
+        <w:instrText xml:space="preserve"> PAGEREF section-3-4 \h </w:instrText>
+      </w:r>
+      <w:r>
+        <w:fldChar w:fldCharType="separate" w:fldLock="0" w:dirty="0"/>
+      </w:r>
+      <w:r>
+        <w:t>1</w:t>
+      </w:r>
+      <w:r>
+        <w:fldChar w:fldCharType="end" w:fldLock="0" w:dirty="0"/>
+      </w:r>
+    </w:p>
+    <w:p>
+      <w:pPr>
+        <w:pStyle w:val="000005"/>
+        <w:tabs>
+          <w:tab w:val="right" w:leader="dot" w:pos="9072"/>
+        </w:tabs>
+        <w:ind w:left="200"/>
+      </w:pPr>
+      <w:r>
+        <w:fldChar w:fldCharType="begin" w:fldLock="0" w:dirty="0"/>
+      </w:r>
+      <w:r>
+        <w:instrText xml:space="preserve"> HYPERLINK \l "section-3-5" </w:instrText>
+      </w:r>
+      <w:r>
+        <w:fldChar w:fldCharType="separate" w:fldLock="0" w:dirty="0"/>
+      </w:r>
+      <w:r>
+        <w:t>3.5 Initial data and import behaviour</w:t>
+      </w:r>
+      <w:r>
+        <w:fldChar w:fldCharType="end" w:fldLock="0" w:dirty="0"/>
+      </w:r>
+      <w:r>
+        <w:tab/>
+      </w:r>
+      <w:r>
+        <w:fldChar w:fldCharType="begin" w:fldLock="0" w:dirty="0"/>
+      </w:r>
+      <w:r>
+        <w:instrText xml:space="preserve"> PAGEREF section-3-5 \h </w:instrText>
       </w:r>
       <w:r>
         <w:fldChar w:fldCharType="separate" w:fldLock="0" w:dirty="0"/>
@@ -515,19 +599,61 @@
         <w:tabs>
           <w:tab w:val="right" w:leader="dot" w:pos="9072"/>
         </w:tabs>
+        <w:ind w:left="0"/>
+      </w:pPr>
+      <w:r>
+        <w:fldChar w:fldCharType="begin" w:fldLock="0" w:dirty="0"/>
+      </w:r>
+      <w:r>
+        <w:instrText xml:space="preserve"> HYPERLINK \l "section-4" </w:instrText>
+      </w:r>
+      <w:r>
+        <w:fldChar w:fldCharType="separate" w:fldLock="0" w:dirty="0"/>
+      </w:r>
+      <w:r>
+        <w:t>4. REST API Design (Part 2)</w:t>
+      </w:r>
+      <w:r>
+        <w:fldChar w:fldCharType="end" w:fldLock="0" w:dirty="0"/>
+      </w:r>
+      <w:r>
+        <w:tab/>
+      </w:r>
+      <w:r>
+        <w:fldChar w:fldCharType="begin" w:fldLock="0" w:dirty="0"/>
+      </w:r>
+      <w:r>
+        <w:instrText xml:space="preserve"> PAGEREF section-4 \h </w:instrText>
+      </w:r>
+      <w:r>
+        <w:fldChar w:fldCharType="separate" w:fldLock="0" w:dirty="0"/>
+      </w:r>
+      <w:r>
+        <w:t>1</w:t>
+      </w:r>
+      <w:r>
+        <w:fldChar w:fldCharType="end" w:fldLock="0" w:dirty="0"/>
+      </w:r>
+    </w:p>
+    <w:p>
+      <w:pPr>
+        <w:pStyle w:val="000005"/>
+        <w:tabs>
+          <w:tab w:val="right" w:leader="dot" w:pos="9072"/>
+        </w:tabs>
         <w:ind w:left="200"/>
       </w:pPr>
       <w:r>
         <w:fldChar w:fldCharType="begin" w:fldLock="0" w:dirty="0"/>
       </w:r>
       <w:r>
-        <w:instrText xml:space="preserve"> HYPERLINK \l "section-3-4" </w:instrText>
+        <w:instrText xml:space="preserve"> HYPERLINK \l "section-4-1" </w:instrText>
       </w:r>
       <w:r>
         <w:fldChar w:fldCharType="separate" w:fldLock="0" w:dirty="0"/>
       </w:r>
       <w:r>
-        <w:t>3.4 Trigger: business rules that cannot be bypassed</w:t>
+        <w:t>4.1 Endpoint reference</w:t>
       </w:r>
       <w:r>
         <w:fldChar w:fldCharType="end" w:fldLock="0" w:dirty="0"/>
@@ -539,7 +665,175 @@
         <w:fldChar w:fldCharType="begin" w:fldLock="0" w:dirty="0"/>
       </w:r>
       <w:r>
-        <w:instrText xml:space="preserve"> PAGEREF section-3-4 \h </w:instrText>
+        <w:instrText xml:space="preserve"> PAGEREF section-4-1 \h </w:instrText>
+      </w:r>
+      <w:r>
+        <w:fldChar w:fldCharType="separate" w:fldLock="0" w:dirty="0"/>
+      </w:r>
+      <w:r>
+        <w:t>1</w:t>
+      </w:r>
+      <w:r>
+        <w:fldChar w:fldCharType="end" w:fldLock="0" w:dirty="0"/>
+      </w:r>
+    </w:p>
+    <w:p>
+      <w:pPr>
+        <w:pStyle w:val="000005"/>
+        <w:tabs>
+          <w:tab w:val="right" w:leader="dot" w:pos="9072"/>
+        </w:tabs>
+        <w:ind w:left="200"/>
+      </w:pPr>
+      <w:r>
+        <w:fldChar w:fldCharType="begin" w:fldLock="0" w:dirty="0"/>
+      </w:r>
+      <w:r>
+        <w:instrText xml:space="preserve"> HYPERLINK \l "section-4-2" </w:instrText>
+      </w:r>
+      <w:r>
+        <w:fldChar w:fldCharType="separate" w:fldLock="0" w:dirty="0"/>
+      </w:r>
+      <w:r>
+        <w:t>4.2 RESTful principles applied</w:t>
+      </w:r>
+      <w:r>
+        <w:fldChar w:fldCharType="end" w:fldLock="0" w:dirty="0"/>
+      </w:r>
+      <w:r>
+        <w:tab/>
+      </w:r>
+      <w:r>
+        <w:fldChar w:fldCharType="begin" w:fldLock="0" w:dirty="0"/>
+      </w:r>
+      <w:r>
+        <w:instrText xml:space="preserve"> PAGEREF section-4-2 \h </w:instrText>
+      </w:r>
+      <w:r>
+        <w:fldChar w:fldCharType="separate" w:fldLock="0" w:dirty="0"/>
+      </w:r>
+      <w:r>
+        <w:t>1</w:t>
+      </w:r>
+      <w:r>
+        <w:fldChar w:fldCharType="end" w:fldLock="0" w:dirty="0"/>
+      </w:r>
+    </w:p>
+    <w:p>
+      <w:pPr>
+        <w:pStyle w:val="000005"/>
+        <w:tabs>
+          <w:tab w:val="right" w:leader="dot" w:pos="9072"/>
+        </w:tabs>
+        <w:ind w:left="200"/>
+      </w:pPr>
+      <w:r>
+        <w:fldChar w:fldCharType="begin" w:fldLock="0" w:dirty="0"/>
+      </w:r>
+      <w:r>
+        <w:instrText xml:space="preserve"> HYPERLINK \l "section-4-3" </w:instrText>
+      </w:r>
+      <w:r>
+        <w:fldChar w:fldCharType="separate" w:fldLock="0" w:dirty="0"/>
+      </w:r>
+      <w:r>
+        <w:t>4.3 Security and robustness</w:t>
+      </w:r>
+      <w:r>
+        <w:fldChar w:fldCharType="end" w:fldLock="0" w:dirty="0"/>
+      </w:r>
+      <w:r>
+        <w:tab/>
+      </w:r>
+      <w:r>
+        <w:fldChar w:fldCharType="begin" w:fldLock="0" w:dirty="0"/>
+      </w:r>
+      <w:r>
+        <w:instrText xml:space="preserve"> PAGEREF section-4-3 \h </w:instrText>
+      </w:r>
+      <w:r>
+        <w:fldChar w:fldCharType="separate" w:fldLock="0" w:dirty="0"/>
+      </w:r>
+      <w:r>
+        <w:t>1</w:t>
+      </w:r>
+      <w:r>
+        <w:fldChar w:fldCharType="end" w:fldLock="0" w:dirty="0"/>
+      </w:r>
+    </w:p>
+    <w:p>
+      <w:pPr>
+        <w:pStyle w:val="000005"/>
+        <w:tabs>
+          <w:tab w:val="right" w:leader="dot" w:pos="9072"/>
+        </w:tabs>
+        <w:ind w:left="200"/>
+      </w:pPr>
+      <w:r>
+        <w:fldChar w:fldCharType="begin" w:fldLock="0" w:dirty="0"/>
+      </w:r>
+      <w:r>
+        <w:instrText xml:space="preserve"> HYPERLINK \l "section-4-4" </w:instrText>
+      </w:r>
+      <w:r>
+        <w:fldChar w:fldCharType="separate" w:fldLock="0" w:dirty="0"/>
+      </w:r>
+      <w:r>
+        <w:t>4.4 Deletion and data integrity</w:t>
+      </w:r>
+      <w:r>
+        <w:fldChar w:fldCharType="end" w:fldLock="0" w:dirty="0"/>
+      </w:r>
+      <w:r>
+        <w:tab/>
+      </w:r>
+      <w:r>
+        <w:fldChar w:fldCharType="begin" w:fldLock="0" w:dirty="0"/>
+      </w:r>
+      <w:r>
+        <w:instrText xml:space="preserve"> PAGEREF section-4-4 \h </w:instrText>
+      </w:r>
+      <w:r>
+        <w:fldChar w:fldCharType="separate" w:fldLock="0" w:dirty="0"/>
+      </w:r>
+      <w:r>
+        <w:t>1</w:t>
+      </w:r>
+      <w:r>
+        <w:fldChar w:fldCharType="end" w:fldLock="0" w:dirty="0"/>
+      </w:r>
+    </w:p>
+    <w:p>
+      <w:pPr>
+        <w:pStyle w:val="000005"/>
+        <w:tabs>
+          <w:tab w:val="right" w:leader="dot" w:pos="9072"/>
+        </w:tabs>
+        <w:ind w:left="200"/>
+      </w:pPr>
+      <w:r>
+        <w:fldChar w:fldCharType="begin" w:fldLock="0" w:dirty="0"/>
+      </w:r>
+      <w:r>
+        <w:instrText xml:space="preserve"> HYPERLINK \l "section-4-5" </w:instrText>
+      </w:r>
+      <w:r>
+        <w:fldChar w:fldCharType="separate" w:fldLock="0" w:dirty="0"/>
+      </w:r>
+      <w:r>
+        <w:t>4.5 Verified behaviour</w:t>
+      </w:r>
+      <w:r>
+        <w:fldChar w:fldCharType="end" w:fldLock="0" w:dirty="0"/>
+      </w:r>
+      <w:r>
+        <w:tab/>
+      </w:r>
+      <w:r>
+        <w:fldChar w:fldCharType="begin" w:fldLock="0" w:dirty="0"/>
+      </w:r>
+      <w:r>
+        <w:instrText xml:space="preserve"> PAGEREF section-4-5 \h </w:instrText>
       </w:r>
       <w:r>
         <w:fldChar w:fldCharType="separate" w:fldLock="0" w:dirty="0"/>
@@ -557,19 +851,19 @@
         <w:tabs>
           <w:tab w:val="right" w:leader="dot" w:pos="9072"/>
         </w:tabs>
-        <w:ind w:left="200"/>
+        <w:ind w:left="0"/>
       </w:pPr>
       <w:r>
         <w:fldChar w:fldCharType="begin" w:fldLock="0" w:dirty="0"/>
       </w:r>
       <w:r>
-        <w:instrText xml:space="preserve"> HYPERLINK \l "section-3-5" </w:instrText>
+        <w:instrText xml:space="preserve"> HYPERLINK \l "section-5" </w:instrText>
       </w:r>
       <w:r>
         <w:fldChar w:fldCharType="separate" w:fldLock="0" w:dirty="0"/>
       </w:r>
       <w:r>
-        <w:t>3.5 Initial data and import behaviour</w:t>
+        <w:t>5. Client-Side Website (Part 3)</w:t>
       </w:r>
       <w:r>
         <w:fldChar w:fldCharType="end" w:fldLock="0" w:dirty="0"/>
@@ -581,7 +875,7 @@
         <w:fldChar w:fldCharType="begin" w:fldLock="0" w:dirty="0"/>
       </w:r>
       <w:r>
-        <w:instrText xml:space="preserve"> PAGEREF section-3-5 \h </w:instrText>
+        <w:instrText xml:space="preserve"> PAGEREF section-5 \h </w:instrText>
       </w:r>
       <w:r>
         <w:fldChar w:fldCharType="separate" w:fldLock="0" w:dirty="0"/>
@@ -595,23 +889,23 @@
     </w:p>
     <w:p>
       <w:pPr>
-        <w:pStyle w:val="000001"/>
+        <w:pStyle w:val="000005"/>
         <w:tabs>
           <w:tab w:val="right" w:leader="dot" w:pos="9072"/>
         </w:tabs>
-        <w:ind w:left="0"/>
+        <w:ind w:left="200"/>
       </w:pPr>
       <w:r>
         <w:fldChar w:fldCharType="begin" w:fldLock="0" w:dirty="0"/>
       </w:r>
       <w:r>
-        <w:instrText xml:space="preserve"> HYPERLINK \l "section-4" </w:instrText>
+        <w:instrText xml:space="preserve"> HYPERLINK \l "section-5-1" </w:instrText>
       </w:r>
       <w:r>
         <w:fldChar w:fldCharType="separate" w:fldLock="0" w:dirty="0"/>
       </w:r>
       <w:r>
-        <w:t>4. REST API Design (Part 2)</w:t>
+        <w:t>5.1 Pages</w:t>
       </w:r>
       <w:r>
         <w:fldChar w:fldCharType="end" w:fldLock="0" w:dirty="0"/>
@@ -623,7 +917,133 @@
         <w:fldChar w:fldCharType="begin" w:fldLock="0" w:dirty="0"/>
       </w:r>
       <w:r>
-        <w:instrText xml:space="preserve"> PAGEREF section-4 \h </w:instrText>
+        <w:instrText xml:space="preserve"> PAGEREF section-5-1 \h </w:instrText>
+      </w:r>
+      <w:r>
+        <w:fldChar w:fldCharType="separate" w:fldLock="0" w:dirty="0"/>
+      </w:r>
+      <w:r>
+        <w:t>1</w:t>
+      </w:r>
+      <w:r>
+        <w:fldChar w:fldCharType="end" w:fldLock="0" w:dirty="0"/>
+      </w:r>
+    </w:p>
+    <w:p>
+      <w:pPr>
+        <w:pStyle w:val="000005"/>
+        <w:tabs>
+          <w:tab w:val="right" w:leader="dot" w:pos="9072"/>
+        </w:tabs>
+        <w:ind w:left="200"/>
+      </w:pPr>
+      <w:r>
+        <w:fldChar w:fldCharType="begin" w:fldLock="0" w:dirty="0"/>
+      </w:r>
+      <w:r>
+        <w:instrText xml:space="preserve"> HYPERLINK \l "section-5-2" </w:instrText>
+      </w:r>
+      <w:r>
+        <w:fldChar w:fldCharType="separate" w:fldLock="0" w:dirty="0"/>
+      </w:r>
+      <w:r>
+        <w:t>5.2 The enhanced event details page</w:t>
+      </w:r>
+      <w:r>
+        <w:fldChar w:fldCharType="end" w:fldLock="0" w:dirty="0"/>
+      </w:r>
+      <w:r>
+        <w:tab/>
+      </w:r>
+      <w:r>
+        <w:fldChar w:fldCharType="begin" w:fldLock="0" w:dirty="0"/>
+      </w:r>
+      <w:r>
+        <w:instrText xml:space="preserve"> PAGEREF section-5-2 \h </w:instrText>
+      </w:r>
+      <w:r>
+        <w:fldChar w:fldCharType="separate" w:fldLock="0" w:dirty="0"/>
+      </w:r>
+      <w:r>
+        <w:t>1</w:t>
+      </w:r>
+      <w:r>
+        <w:fldChar w:fldCharType="end" w:fldLock="0" w:dirty="0"/>
+      </w:r>
+    </w:p>
+    <w:p>
+      <w:pPr>
+        <w:pStyle w:val="000005"/>
+        <w:tabs>
+          <w:tab w:val="right" w:leader="dot" w:pos="9072"/>
+        </w:tabs>
+        <w:ind w:left="200"/>
+      </w:pPr>
+      <w:r>
+        <w:fldChar w:fldCharType="begin" w:fldLock="0" w:dirty="0"/>
+      </w:r>
+      <w:r>
+        <w:instrText xml:space="preserve"> HYPERLINK \l "section-5-3" </w:instrText>
+      </w:r>
+      <w:r>
+        <w:fldChar w:fldCharType="separate" w:fldLock="0" w:dirty="0"/>
+      </w:r>
+      <w:r>
+        <w:t>5.3 The new registration page</w:t>
+      </w:r>
+      <w:r>
+        <w:fldChar w:fldCharType="end" w:fldLock="0" w:dirty="0"/>
+      </w:r>
+      <w:r>
+        <w:tab/>
+      </w:r>
+      <w:r>
+        <w:fldChar w:fldCharType="begin" w:fldLock="0" w:dirty="0"/>
+      </w:r>
+      <w:r>
+        <w:instrText xml:space="preserve"> PAGEREF section-5-3 \h </w:instrText>
+      </w:r>
+      <w:r>
+        <w:fldChar w:fldCharType="separate" w:fldLock="0" w:dirty="0"/>
+      </w:r>
+      <w:r>
+        <w:t>1</w:t>
+      </w:r>
+      <w:r>
+        <w:fldChar w:fldCharType="end" w:fldLock="0" w:dirty="0"/>
+      </w:r>
+    </w:p>
+    <w:p>
+      <w:pPr>
+        <w:pStyle w:val="000005"/>
+        <w:tabs>
+          <w:tab w:val="right" w:leader="dot" w:pos="9072"/>
+        </w:tabs>
+        <w:ind w:left="200"/>
+      </w:pPr>
+      <w:r>
+        <w:fldChar w:fldCharType="begin" w:fldLock="0" w:dirty="0"/>
+      </w:r>
+      <w:r>
+        <w:instrText xml:space="preserve"> HYPERLINK \l "section-5-4" </w:instrText>
+      </w:r>
+      <w:r>
+        <w:fldChar w:fldCharType="separate" w:fldLock="0" w:dirty="0"/>
+      </w:r>
+      <w:r>
+        <w:t>5.4 Angular 22 techniques used</w:t>
+      </w:r>
+      <w:r>
+        <w:fldChar w:fldCharType="end" w:fldLock="0" w:dirty="0"/>
+      </w:r>
+      <w:r>
+        <w:tab/>
+      </w:r>
+      <w:r>
+        <w:fldChar w:fldCharType="begin" w:fldLock="0" w:dirty="0"/>
+      </w:r>
+      <w:r>
+        <w:instrText xml:space="preserve"> PAGEREF section-5-4 \h </w:instrText>
       </w:r>
       <w:r>
         <w:fldChar w:fldCharType="separate" w:fldLock="0" w:dirty="0"/>
@@ -641,19 +1061,19 @@
         <w:tabs>
           <w:tab w:val="right" w:leader="dot" w:pos="9072"/>
         </w:tabs>
-        <w:ind w:left="200"/>
+        <w:ind w:left="0"/>
       </w:pPr>
       <w:r>
         <w:fldChar w:fldCharType="begin" w:fldLock="0" w:dirty="0"/>
       </w:r>
       <w:r>
-        <w:instrText xml:space="preserve"> HYPERLINK \l "section-4-1" </w:instrText>
+        <w:instrText xml:space="preserve"> HYPERLINK \l "section-6" </w:instrText>
       </w:r>
       <w:r>
         <w:fldChar w:fldCharType="separate" w:fldLock="0" w:dirty="0"/>
       </w:r>
       <w:r>
-        <w:t>4.1 Endpoint reference</w:t>
+        <w:t>6. Admin-Side Website (Part 4)</w:t>
       </w:r>
       <w:r>
         <w:fldChar w:fldCharType="end" w:fldLock="0" w:dirty="0"/>
@@ -665,7 +1085,7 @@
         <w:fldChar w:fldCharType="begin" w:fldLock="0" w:dirty="0"/>
       </w:r>
       <w:r>
-        <w:instrText xml:space="preserve"> PAGEREF section-4-1 \h </w:instrText>
+        <w:instrText xml:space="preserve"> PAGEREF section-6 \h </w:instrText>
       </w:r>
       <w:r>
         <w:fldChar w:fldCharType="separate" w:fldLock="0" w:dirty="0"/>
@@ -683,19 +1103,19 @@
         <w:tabs>
           <w:tab w:val="right" w:leader="dot" w:pos="9072"/>
         </w:tabs>
-        <w:ind w:left="200"/>
+        <w:ind w:left="0"/>
       </w:pPr>
       <w:r>
         <w:fldChar w:fldCharType="begin" w:fldLock="0" w:dirty="0"/>
       </w:r>
       <w:r>
-        <w:instrText xml:space="preserve"> HYPERLINK \l "section-4-2" </w:instrText>
+        <w:instrText xml:space="preserve"> HYPERLINK \l "section-7" </w:instrText>
       </w:r>
       <w:r>
         <w:fldChar w:fldCharType="separate" w:fldLock="0" w:dirty="0"/>
       </w:r>
       <w:r>
-        <w:t>4.2 RESTful principles applied</w:t>
+        <w:t>7. External Weather API (Part 6 — optional)</w:t>
       </w:r>
       <w:r>
         <w:fldChar w:fldCharType="end" w:fldLock="0" w:dirty="0"/>
@@ -707,7 +1127,7 @@
         <w:fldChar w:fldCharType="begin" w:fldLock="0" w:dirty="0"/>
       </w:r>
       <w:r>
-        <w:instrText xml:space="preserve"> PAGEREF section-4-2 \h </w:instrText>
+        <w:instrText xml:space="preserve"> PAGEREF section-7 \h </w:instrText>
       </w:r>
       <w:r>
         <w:fldChar w:fldCharType="separate" w:fldLock="0" w:dirty="0"/>
@@ -725,19 +1145,19 @@
         <w:tabs>
           <w:tab w:val="right" w:leader="dot" w:pos="9072"/>
         </w:tabs>
-        <w:ind w:left="200"/>
+        <w:ind w:left="0"/>
       </w:pPr>
       <w:r>
         <w:fldChar w:fldCharType="begin" w:fldLock="0" w:dirty="0"/>
       </w:r>
       <w:r>
-        <w:instrText xml:space="preserve"> HYPERLINK \l "section-4-3" </w:instrText>
+        <w:instrText xml:space="preserve"> HYPERLINK \l "section-8" </w:instrText>
       </w:r>
       <w:r>
         <w:fldChar w:fldCharType="separate" w:fldLock="0" w:dirty="0"/>
       </w:r>
       <w:r>
-        <w:t>4.3 Security and robustness</w:t>
+        <w:t>8. Deployment to the SCU cPanel (Part 5)</w:t>
       </w:r>
       <w:r>
         <w:fldChar w:fldCharType="end" w:fldLock="0" w:dirty="0"/>
@@ -749,7 +1169,7 @@
         <w:fldChar w:fldCharType="begin" w:fldLock="0" w:dirty="0"/>
       </w:r>
       <w:r>
-        <w:instrText xml:space="preserve"> PAGEREF section-4-3 \h </w:instrText>
+        <w:instrText xml:space="preserve"> PAGEREF section-8 \h </w:instrText>
       </w:r>
       <w:r>
         <w:fldChar w:fldCharType="separate" w:fldLock="0" w:dirty="0"/>
@@ -767,19 +1187,19 @@
         <w:tabs>
           <w:tab w:val="right" w:leader="dot" w:pos="9072"/>
         </w:tabs>
-        <w:ind w:left="200"/>
+        <w:ind w:left="0"/>
       </w:pPr>
       <w:r>
         <w:fldChar w:fldCharType="begin" w:fldLock="0" w:dirty="0"/>
       </w:r>
       <w:r>
-        <w:instrText xml:space="preserve"> HYPERLINK \l "section-4-4" </w:instrText>
+        <w:instrText xml:space="preserve"> HYPERLINK \l "section-9" </w:instrText>
       </w:r>
       <w:r>
         <w:fldChar w:fldCharType="separate" w:fldLock="0" w:dirty="0"/>
       </w:r>
       <w:r>
-        <w:t>4.4 Deletion and data integrity</w:t>
+        <w:t>9. Testing and Verification</w:t>
       </w:r>
       <w:r>
         <w:fldChar w:fldCharType="end" w:fldLock="0" w:dirty="0"/>
@@ -791,7 +1211,7 @@
         <w:fldChar w:fldCharType="begin" w:fldLock="0" w:dirty="0"/>
       </w:r>
       <w:r>
-        <w:instrText xml:space="preserve"> PAGEREF section-4-4 \h </w:instrText>
+        <w:instrText xml:space="preserve"> PAGEREF section-9 \h </w:instrText>
       </w:r>
       <w:r>
         <w:fldChar w:fldCharType="separate" w:fldLock="0" w:dirty="0"/>
@@ -809,61 +1229,19 @@
         <w:tabs>
           <w:tab w:val="right" w:leader="dot" w:pos="9072"/>
         </w:tabs>
-        <w:ind w:left="200"/>
-      </w:pPr>
-      <w:r>
-        <w:fldChar w:fldCharType="begin" w:fldLock="0" w:dirty="0"/>
-      </w:r>
-      <w:r>
-        <w:instrText xml:space="preserve"> HYPERLINK \l "section-4-5" </w:instrText>
-      </w:r>
-      <w:r>
-        <w:fldChar w:fldCharType="separate" w:fldLock="0" w:dirty="0"/>
-      </w:r>
-      <w:r>
-        <w:t>4.5 Verified behaviour</w:t>
-      </w:r>
-      <w:r>
-        <w:fldChar w:fldCharType="end" w:fldLock="0" w:dirty="0"/>
-      </w:r>
-      <w:r>
-        <w:tab/>
-      </w:r>
-      <w:r>
-        <w:fldChar w:fldCharType="begin" w:fldLock="0" w:dirty="0"/>
-      </w:r>
-      <w:r>
-        <w:instrText xml:space="preserve"> PAGEREF section-4-5 \h </w:instrText>
-      </w:r>
-      <w:r>
-        <w:fldChar w:fldCharType="separate" w:fldLock="0" w:dirty="0"/>
-      </w:r>
-      <w:r>
-        <w:t>1</w:t>
-      </w:r>
-      <w:r>
-        <w:fldChar w:fldCharType="end" w:fldLock="0" w:dirty="0"/>
-      </w:r>
-    </w:p>
-    <w:p>
-      <w:pPr>
-        <w:pStyle w:val="000001"/>
-        <w:tabs>
-          <w:tab w:val="right" w:leader="dot" w:pos="9072"/>
-        </w:tabs>
         <w:ind w:left="0"/>
       </w:pPr>
       <w:r>
         <w:fldChar w:fldCharType="begin" w:fldLock="0" w:dirty="0"/>
       </w:r>
       <w:r>
-        <w:instrText xml:space="preserve"> HYPERLINK \l "section-5" </w:instrText>
+        <w:instrText xml:space="preserve"> HYPERLINK \l "section-10" </w:instrText>
       </w:r>
       <w:r>
         <w:fldChar w:fldCharType="separate" w:fldLock="0" w:dirty="0"/>
       </w:r>
       <w:r>
-        <w:t>5. Client-Side Website (Part 3)</w:t>
+        <w:t>10. Team Work and Task Allocation (ULO2)</w:t>
       </w:r>
       <w:r>
         <w:fldChar w:fldCharType="end" w:fldLock="0" w:dirty="0"/>
@@ -875,7 +1253,7 @@
         <w:fldChar w:fldCharType="begin" w:fldLock="0" w:dirty="0"/>
       </w:r>
       <w:r>
-        <w:instrText xml:space="preserve"> PAGEREF section-5 \h </w:instrText>
+        <w:instrText xml:space="preserve"> PAGEREF section-10 \h </w:instrText>
       </w:r>
       <w:r>
         <w:fldChar w:fldCharType="separate" w:fldLock="0" w:dirty="0"/>
@@ -893,19 +1271,19 @@
         <w:tabs>
           <w:tab w:val="right" w:leader="dot" w:pos="9072"/>
         </w:tabs>
-        <w:ind w:left="200"/>
+        <w:ind w:left="0"/>
       </w:pPr>
       <w:r>
         <w:fldChar w:fldCharType="begin" w:fldLock="0" w:dirty="0"/>
       </w:r>
       <w:r>
-        <w:instrText xml:space="preserve"> HYPERLINK \l "section-5-1" </w:instrText>
+        <w:instrText xml:space="preserve"> HYPERLINK \l "section-11" </w:instrText>
       </w:r>
       <w:r>
         <w:fldChar w:fldCharType="separate" w:fldLock="0" w:dirty="0"/>
       </w:r>
       <w:r>
-        <w:t>5.1 Pages</w:t>
+        <w:t>11. Generative AI Use Declaration</w:t>
       </w:r>
       <w:r>
         <w:fldChar w:fldCharType="end" w:fldLock="0" w:dirty="0"/>
@@ -917,7 +1295,7 @@
         <w:fldChar w:fldCharType="begin" w:fldLock="0" w:dirty="0"/>
       </w:r>
       <w:r>
-        <w:instrText xml:space="preserve"> PAGEREF section-5-1 \h </w:instrText>
+        <w:instrText xml:space="preserve"> PAGEREF section-11 \h </w:instrText>
       </w:r>
       <w:r>
         <w:fldChar w:fldCharType="separate" w:fldLock="0" w:dirty="0"/>
@@ -935,19 +1313,19 @@
         <w:tabs>
           <w:tab w:val="right" w:leader="dot" w:pos="9072"/>
         </w:tabs>
-        <w:ind w:left="200"/>
+        <w:ind w:left="0"/>
       </w:pPr>
       <w:r>
         <w:fldChar w:fldCharType="begin" w:fldLock="0" w:dirty="0"/>
       </w:r>
       <w:r>
-        <w:instrText xml:space="preserve"> HYPERLINK \l "section-5-2" </w:instrText>
+        <w:instrText xml:space="preserve"> HYPERLINK \l "section-12" </w:instrText>
       </w:r>
       <w:r>
         <w:fldChar w:fldCharType="separate" w:fldLock="0" w:dirty="0"/>
       </w:r>
       <w:r>
-        <w:t>5.2 The enhanced event details page</w:t>
+        <w:t>12. References</w:t>
       </w:r>
       <w:r>
         <w:fldChar w:fldCharType="end" w:fldLock="0" w:dirty="0"/>
@@ -959,7 +1337,7 @@
         <w:fldChar w:fldCharType="begin" w:fldLock="0" w:dirty="0"/>
       </w:r>
       <w:r>
-        <w:instrText xml:space="preserve"> PAGEREF section-5-2 \h </w:instrText>
+        <w:instrText xml:space="preserve"> PAGEREF section-12 \h </w:instrText>
       </w:r>
       <w:r>
         <w:fldChar w:fldCharType="separate" w:fldLock="0" w:dirty="0"/>
@@ -974,384 +1352,6 @@
     <w:p>
       <w:pPr>
         <w:pStyle w:val="000003"/>
-        <w:tabs>
-          <w:tab w:val="right" w:leader="dot" w:pos="9072"/>
-        </w:tabs>
-        <w:ind w:left="200"/>
-      </w:pPr>
-      <w:r>
-        <w:fldChar w:fldCharType="begin" w:fldLock="0" w:dirty="0"/>
-      </w:r>
-      <w:r>
-        <w:instrText xml:space="preserve"> HYPERLINK \l "section-5-3" </w:instrText>
-      </w:r>
-      <w:r>
-        <w:fldChar w:fldCharType="separate" w:fldLock="0" w:dirty="0"/>
-      </w:r>
-      <w:r>
-        <w:t>5.3 The new registration page</w:t>
-      </w:r>
-      <w:r>
-        <w:fldChar w:fldCharType="end" w:fldLock="0" w:dirty="0"/>
-      </w:r>
-      <w:r>
-        <w:tab/>
-      </w:r>
-      <w:r>
-        <w:fldChar w:fldCharType="begin" w:fldLock="0" w:dirty="0"/>
-      </w:r>
-      <w:r>
-        <w:instrText xml:space="preserve"> PAGEREF section-5-3 \h </w:instrText>
-      </w:r>
-      <w:r>
-        <w:fldChar w:fldCharType="separate" w:fldLock="0" w:dirty="0"/>
-      </w:r>
-      <w:r>
-        <w:t>1</w:t>
-      </w:r>
-      <w:r>
-        <w:fldChar w:fldCharType="end" w:fldLock="0" w:dirty="0"/>
-      </w:r>
-    </w:p>
-    <w:p>
-      <w:pPr>
-        <w:pStyle w:val="000003"/>
-        <w:tabs>
-          <w:tab w:val="right" w:leader="dot" w:pos="9072"/>
-        </w:tabs>
-        <w:ind w:left="200"/>
-      </w:pPr>
-      <w:r>
-        <w:fldChar w:fldCharType="begin" w:fldLock="0" w:dirty="0"/>
-      </w:r>
-      <w:r>
-        <w:instrText xml:space="preserve"> HYPERLINK \l "section-5-4" </w:instrText>
-      </w:r>
-      <w:r>
-        <w:fldChar w:fldCharType="separate" w:fldLock="0" w:dirty="0"/>
-      </w:r>
-      <w:r>
-        <w:t>5.4 Angular 22 techniques used</w:t>
-      </w:r>
-      <w:r>
-        <w:fldChar w:fldCharType="end" w:fldLock="0" w:dirty="0"/>
-      </w:r>
-      <w:r>
-        <w:tab/>
-      </w:r>
-      <w:r>
-        <w:fldChar w:fldCharType="begin" w:fldLock="0" w:dirty="0"/>
-      </w:r>
-      <w:r>
-        <w:instrText xml:space="preserve"> PAGEREF section-5-4 \h </w:instrText>
-      </w:r>
-      <w:r>
-        <w:fldChar w:fldCharType="separate" w:fldLock="0" w:dirty="0"/>
-      </w:r>
-      <w:r>
-        <w:t>1</w:t>
-      </w:r>
-      <w:r>
-        <w:fldChar w:fldCharType="end" w:fldLock="0" w:dirty="0"/>
-      </w:r>
-    </w:p>
-    <w:p>
-      <w:pPr>
-        <w:pStyle w:val="000001"/>
-        <w:tabs>
-          <w:tab w:val="right" w:leader="dot" w:pos="9072"/>
-        </w:tabs>
-        <w:ind w:left="0"/>
-      </w:pPr>
-      <w:r>
-        <w:fldChar w:fldCharType="begin" w:fldLock="0" w:dirty="0"/>
-      </w:r>
-      <w:r>
-        <w:instrText xml:space="preserve"> HYPERLINK \l "section-6" </w:instrText>
-      </w:r>
-      <w:r>
-        <w:fldChar w:fldCharType="separate" w:fldLock="0" w:dirty="0"/>
-      </w:r>
-      <w:r>
-        <w:t>6. Admin-Side Website (Part 4)</w:t>
-      </w:r>
-      <w:r>
-        <w:fldChar w:fldCharType="end" w:fldLock="0" w:dirty="0"/>
-      </w:r>
-      <w:r>
-        <w:tab/>
-      </w:r>
-      <w:r>
-        <w:fldChar w:fldCharType="begin" w:fldLock="0" w:dirty="0"/>
-      </w:r>
-      <w:r>
-        <w:instrText xml:space="preserve"> PAGEREF section-6 \h </w:instrText>
-      </w:r>
-      <w:r>
-        <w:fldChar w:fldCharType="separate" w:fldLock="0" w:dirty="0"/>
-      </w:r>
-      <w:r>
-        <w:t>1</w:t>
-      </w:r>
-      <w:r>
-        <w:fldChar w:fldCharType="end" w:fldLock="0" w:dirty="0"/>
-      </w:r>
-    </w:p>
-    <w:p>
-      <w:pPr>
-        <w:pStyle w:val="000001"/>
-        <w:tabs>
-          <w:tab w:val="right" w:leader="dot" w:pos="9072"/>
-        </w:tabs>
-        <w:ind w:left="0"/>
-      </w:pPr>
-      <w:r>
-        <w:fldChar w:fldCharType="begin" w:fldLock="0" w:dirty="0"/>
-      </w:r>
-      <w:r>
-        <w:instrText xml:space="preserve"> HYPERLINK \l "section-7" </w:instrText>
-      </w:r>
-      <w:r>
-        <w:fldChar w:fldCharType="separate" w:fldLock="0" w:dirty="0"/>
-      </w:r>
-      <w:r>
-        <w:t>7. External Weather API (Part 6 — optional)</w:t>
-      </w:r>
-      <w:r>
-        <w:fldChar w:fldCharType="end" w:fldLock="0" w:dirty="0"/>
-      </w:r>
-      <w:r>
-        <w:tab/>
-      </w:r>
-      <w:r>
-        <w:fldChar w:fldCharType="begin" w:fldLock="0" w:dirty="0"/>
-      </w:r>
-      <w:r>
-        <w:instrText xml:space="preserve"> PAGEREF section-7 \h </w:instrText>
-      </w:r>
-      <w:r>
-        <w:fldChar w:fldCharType="separate" w:fldLock="0" w:dirty="0"/>
-      </w:r>
-      <w:r>
-        <w:t>1</w:t>
-      </w:r>
-      <w:r>
-        <w:fldChar w:fldCharType="end" w:fldLock="0" w:dirty="0"/>
-      </w:r>
-    </w:p>
-    <w:p>
-      <w:pPr>
-        <w:pStyle w:val="000001"/>
-        <w:tabs>
-          <w:tab w:val="right" w:leader="dot" w:pos="9072"/>
-        </w:tabs>
-        <w:ind w:left="0"/>
-      </w:pPr>
-      <w:r>
-        <w:fldChar w:fldCharType="begin" w:fldLock="0" w:dirty="0"/>
-      </w:r>
-      <w:r>
-        <w:instrText xml:space="preserve"> HYPERLINK \l "section-8" </w:instrText>
-      </w:r>
-      <w:r>
-        <w:fldChar w:fldCharType="separate" w:fldLock="0" w:dirty="0"/>
-      </w:r>
-      <w:r>
-        <w:t>8. Deployment to the SCU cPanel (Part 5)</w:t>
-      </w:r>
-      <w:r>
-        <w:fldChar w:fldCharType="end" w:fldLock="0" w:dirty="0"/>
-      </w:r>
-      <w:r>
-        <w:tab/>
-      </w:r>
-      <w:r>
-        <w:fldChar w:fldCharType="begin" w:fldLock="0" w:dirty="0"/>
-      </w:r>
-      <w:r>
-        <w:instrText xml:space="preserve"> PAGEREF section-8 \h </w:instrText>
-      </w:r>
-      <w:r>
-        <w:fldChar w:fldCharType="separate" w:fldLock="0" w:dirty="0"/>
-      </w:r>
-      <w:r>
-        <w:t>1</w:t>
-      </w:r>
-      <w:r>
-        <w:fldChar w:fldCharType="end" w:fldLock="0" w:dirty="0"/>
-      </w:r>
-    </w:p>
-    <w:p>
-      <w:pPr>
-        <w:pStyle w:val="000001"/>
-        <w:tabs>
-          <w:tab w:val="right" w:leader="dot" w:pos="9072"/>
-        </w:tabs>
-        <w:ind w:left="0"/>
-      </w:pPr>
-      <w:r>
-        <w:fldChar w:fldCharType="begin" w:fldLock="0" w:dirty="0"/>
-      </w:r>
-      <w:r>
-        <w:instrText xml:space="preserve"> HYPERLINK \l "section-9" </w:instrText>
-      </w:r>
-      <w:r>
-        <w:fldChar w:fldCharType="separate" w:fldLock="0" w:dirty="0"/>
-      </w:r>
-      <w:r>
-        <w:t>9. Testing and Verification</w:t>
-      </w:r>
-      <w:r>
-        <w:fldChar w:fldCharType="end" w:fldLock="0" w:dirty="0"/>
-      </w:r>
-      <w:r>
-        <w:tab/>
-      </w:r>
-      <w:r>
-        <w:fldChar w:fldCharType="begin" w:fldLock="0" w:dirty="0"/>
-      </w:r>
-      <w:r>
-        <w:instrText xml:space="preserve"> PAGEREF section-9 \h </w:instrText>
-      </w:r>
-      <w:r>
-        <w:fldChar w:fldCharType="separate" w:fldLock="0" w:dirty="0"/>
-      </w:r>
-      <w:r>
-        <w:t>1</w:t>
-      </w:r>
-      <w:r>
-        <w:fldChar w:fldCharType="end" w:fldLock="0" w:dirty="0"/>
-      </w:r>
-    </w:p>
-    <w:p>
-      <w:pPr>
-        <w:pStyle w:val="000001"/>
-        <w:tabs>
-          <w:tab w:val="right" w:leader="dot" w:pos="9072"/>
-        </w:tabs>
-        <w:ind w:left="0"/>
-      </w:pPr>
-      <w:r>
-        <w:fldChar w:fldCharType="begin" w:fldLock="0" w:dirty="0"/>
-      </w:r>
-      <w:r>
-        <w:instrText xml:space="preserve"> HYPERLINK \l "section-10" </w:instrText>
-      </w:r>
-      <w:r>
-        <w:fldChar w:fldCharType="separate" w:fldLock="0" w:dirty="0"/>
-      </w:r>
-      <w:r>
-        <w:t>10. Team Work and Task Allocation (ULO2)</w:t>
-      </w:r>
-      <w:r>
-        <w:fldChar w:fldCharType="end" w:fldLock="0" w:dirty="0"/>
-      </w:r>
-      <w:r>
-        <w:tab/>
-      </w:r>
-      <w:r>
-        <w:fldChar w:fldCharType="begin" w:fldLock="0" w:dirty="0"/>
-      </w:r>
-      <w:r>
-        <w:instrText xml:space="preserve"> PAGEREF section-10 \h </w:instrText>
-      </w:r>
-      <w:r>
-        <w:fldChar w:fldCharType="separate" w:fldLock="0" w:dirty="0"/>
-      </w:r>
-      <w:r>
-        <w:t>1</w:t>
-      </w:r>
-      <w:r>
-        <w:fldChar w:fldCharType="end" w:fldLock="0" w:dirty="0"/>
-      </w:r>
-    </w:p>
-    <w:p>
-      <w:pPr>
-        <w:pStyle w:val="000001"/>
-        <w:tabs>
-          <w:tab w:val="right" w:leader="dot" w:pos="9072"/>
-        </w:tabs>
-        <w:ind w:left="0"/>
-      </w:pPr>
-      <w:r>
-        <w:fldChar w:fldCharType="begin" w:fldLock="0" w:dirty="0"/>
-      </w:r>
-      <w:r>
-        <w:instrText xml:space="preserve"> HYPERLINK \l "section-11" </w:instrText>
-      </w:r>
-      <w:r>
-        <w:fldChar w:fldCharType="separate" w:fldLock="0" w:dirty="0"/>
-      </w:r>
-      <w:r>
-        <w:t>11. Generative AI Use Declaration</w:t>
-      </w:r>
-      <w:r>
-        <w:fldChar w:fldCharType="end" w:fldLock="0" w:dirty="0"/>
-      </w:r>
-      <w:r>
-        <w:tab/>
-      </w:r>
-      <w:r>
-        <w:fldChar w:fldCharType="begin" w:fldLock="0" w:dirty="0"/>
-      </w:r>
-      <w:r>
-        <w:instrText xml:space="preserve"> PAGEREF section-11 \h </w:instrText>
-      </w:r>
-      <w:r>
-        <w:fldChar w:fldCharType="separate" w:fldLock="0" w:dirty="0"/>
-      </w:r>
-      <w:r>
-        <w:t>1</w:t>
-      </w:r>
-      <w:r>
-        <w:fldChar w:fldCharType="end" w:fldLock="0" w:dirty="0"/>
-      </w:r>
-    </w:p>
-    <w:p>
-      <w:pPr>
-        <w:pStyle w:val="000001"/>
-        <w:tabs>
-          <w:tab w:val="right" w:leader="dot" w:pos="9072"/>
-        </w:tabs>
-        <w:ind w:left="0"/>
-      </w:pPr>
-      <w:r>
-        <w:fldChar w:fldCharType="begin" w:fldLock="0" w:dirty="0"/>
-      </w:r>
-      <w:r>
-        <w:instrText xml:space="preserve"> HYPERLINK \l "section-12" </w:instrText>
-      </w:r>
-      <w:r>
-        <w:fldChar w:fldCharType="separate" w:fldLock="0" w:dirty="0"/>
-      </w:r>
-      <w:r>
-        <w:t>12. References</w:t>
-      </w:r>
-      <w:r>
-        <w:fldChar w:fldCharType="end" w:fldLock="0" w:dirty="0"/>
-      </w:r>
-      <w:r>
-        <w:tab/>
-      </w:r>
-      <w:r>
-        <w:fldChar w:fldCharType="begin" w:fldLock="0" w:dirty="0"/>
-      </w:r>
-      <w:r>
-        <w:instrText xml:space="preserve"> PAGEREF section-12 \h </w:instrText>
-      </w:r>
-      <w:r>
-        <w:fldChar w:fldCharType="separate" w:fldLock="0" w:dirty="0"/>
-      </w:r>
-      <w:r>
-        <w:t>1</w:t>
-      </w:r>
-      <w:r>
-        <w:fldChar w:fldCharType="end" w:fldLock="0" w:dirty="0"/>
-      </w:r>
-    </w:p>
-    <w:p>
-      <w:pPr>
-        <w:pStyle w:val="000001"/>
         <w:tabs>
           <w:tab w:val="right" w:leader="dot" w:pos="9072"/>
         </w:tabs>
@@ -1405,7 +1405,7 @@
     </w:p>
     <w:p>
       <w:pPr>
-        <w:pStyle w:val="000005"/>
+        <w:pStyle w:val="000001"/>
         <w:keepNext w:val="1"/>
         <w:keepLines w:val="1"/>
         <w:pBdr>
@@ -1996,7 +1996,7 @@
     </w:p>
     <w:p>
       <w:pPr>
-        <w:pStyle w:val="000005"/>
+        <w:pStyle w:val="000001"/>
         <w:keepNext w:val="1"/>
         <w:keepLines w:val="1"/>
         <w:pBdr>
@@ -3019,7 +3019,7 @@
     </w:p>
     <w:p>
       <w:pPr>
-        <w:pStyle w:val="000005"/>
+        <w:pStyle w:val="000001"/>
         <w:keepNext w:val="1"/>
         <w:keepLines w:val="1"/>
         <w:pBdr>
@@ -6855,7 +6855,7 @@
     </w:p>
     <w:p>
       <w:pPr>
-        <w:pStyle w:val="000005"/>
+        <w:pStyle w:val="000001"/>
         <w:keepNext w:val="1"/>
         <w:keepLines w:val="1"/>
         <w:pBdr>
@@ -10787,7 +10787,7 @@
     </w:p>
     <w:p>
       <w:pPr>
-        <w:pStyle w:val="000005"/>
+        <w:pStyle w:val="000001"/>
         <w:keepNext w:val="1"/>
         <w:keepLines w:val="1"/>
         <w:pBdr>
@@ -12186,7 +12186,7 @@
     </w:p>
     <w:p>
       <w:pPr>
-        <w:pStyle w:val="000005"/>
+        <w:pStyle w:val="000001"/>
         <w:keepNext w:val="1"/>
         <w:keepLines w:val="1"/>
         <w:pBdr>
@@ -12778,7 +12778,7 @@
     </w:p>
     <w:p>
       <w:pPr>
-        <w:pStyle w:val="000005"/>
+        <w:pStyle w:val="000001"/>
         <w:keepNext w:val="1"/>
         <w:keepLines w:val="1"/>
         <w:pBdr>
@@ -13002,7 +13002,7 @@
     </w:p>
     <w:p>
       <w:pPr>
-        <w:pStyle w:val="000005"/>
+        <w:pStyle w:val="000001"/>
         <w:keepNext w:val="1"/>
         <w:keepLines w:val="1"/>
         <w:pBdr>
@@ -13200,7 +13200,7 @@
     </w:p>
     <w:p>
       <w:pPr>
-        <w:pStyle w:val="000005"/>
+        <w:pStyle w:val="000001"/>
         <w:keepNext w:val="1"/>
         <w:keepLines w:val="1"/>
         <w:pBdr>
@@ -14295,7 +14295,7 @@
     </w:p>
     <w:p>
       <w:pPr>
-        <w:pStyle w:val="000005"/>
+        <w:pStyle w:val="000001"/>
         <w:keepNext w:val="1"/>
         <w:keepLines w:val="1"/>
         <w:pBdr>
@@ -15305,7 +15305,7 @@
     </w:p>
     <w:p>
       <w:pPr>
-        <w:pStyle w:val="000005"/>
+        <w:pStyle w:val="000001"/>
         <w:keepNext w:val="1"/>
         <w:keepLines w:val="1"/>
         <w:pBdr>
@@ -15592,7 +15592,7 @@
     </w:p>
     <w:p>
       <w:pPr>
-        <w:pStyle w:val="000005"/>
+        <w:pStyle w:val="000001"/>
         <w:keepNext w:val="1"/>
         <w:keepLines w:val="1"/>
         <w:pBdr>
@@ -15944,7 +15944,7 @@
     </w:p>
     <w:p>
       <w:pPr>
-        <w:pStyle w:val="000005"/>
+        <w:pStyle w:val="000001"/>
         <w:keepNext w:val="1"/>
         <w:keepLines w:val="1"/>
         <w:pBdr>
@@ -17035,12 +17035,15 @@
   <w:abstractNum w:abstractNumId="0">
     <w:lvl w:ilvl="0">
       <w:start w:val="1"/>
-      <w:numFmt w:val="decimal"/>
-      <w:lvlText w:val="%1."/>
+      <w:numFmt w:val="bullet"/>
+      <w:lvlText w:val=""/>
       <w:lvlJc w:val="left"/>
       <w:pPr>
         <w:ind w:left="420" w:hanging="420"/>
       </w:pPr>
+      <w:rPr>
+        <w:rFonts w:hint="default" w:ascii="Wingdings" w:hAnsi="Wingdings"/>
+      </w:rPr>
     </w:lvl>
   </w:abstractNum>
   <w:abstractNum w:abstractNumId="1">
@@ -17068,15 +17071,12 @@
   <w:abstractNum w:abstractNumId="3">
     <w:lvl w:ilvl="0">
       <w:start w:val="1"/>
-      <w:numFmt w:val="bullet"/>
-      <w:lvlText w:val=""/>
+      <w:numFmt w:val="decimal"/>
+      <w:lvlText w:val="%1."/>
       <w:lvlJc w:val="left"/>
       <w:pPr>
         <w:ind w:left="420" w:hanging="420"/>
       </w:pPr>
-      <w:rPr>
-        <w:rFonts w:hint="default" w:ascii="Wingdings" w:hAnsi="Wingdings"/>
-      </w:rPr>
     </w:lvl>
   </w:abstractNum>
   <w:abstractNum w:abstractNumId="4">
@@ -17101,23 +17101,23 @@
       </w:pPr>
     </w:lvl>
   </w:abstractNum>
+  <w:num w:numId="4">
+    <w:abstractNumId w:val="5"/>
+  </w:num>
   <w:num w:numId="2">
-    <w:abstractNumId w:val="3"/>
+    <w:abstractNumId w:val="0"/>
+  </w:num>
+  <w:num w:numId="1">
+    <w:abstractNumId w:val="1"/>
   </w:num>
   <w:num w:numId="5">
-    <w:abstractNumId w:val="5"/>
-  </w:num>
-  <w:num w:numId="6">
-    <w:abstractNumId w:val="1"/>
-  </w:num>
-  <w:num w:numId="1">
-    <w:abstractNumId w:val="0"/>
-  </w:num>
-  <w:num w:numId="4">
-    <w:abstractNumId w:val="4"/>
+    <w:abstractNumId w:val="3"/>
   </w:num>
   <w:num w:numId="3">
     <w:abstractNumId w:val="2"/>
+  </w:num>
+  <w:num w:numId="6">
+    <w:abstractNumId w:val="4"/>
   </w:num>
 </w:numbering>
 </file>
@@ -17141,129 +17141,95 @@
     </w:pPrDefault>
   </w:docDefaults>
   <w:latentStyles w:defLockedState="0" w:defUIPriority="99" w:defSemiHidden="0" w:defUnhideWhenUsed="0" w:defQFormat="0" w:count="88">
+    <w:lsdException w:name="index 4" w:semiHidden="1" w:unhideWhenUsed="1"/>
+    <w:lsdException w:name="List" w:semiHidden="1" w:unhideWhenUsed="1"/>
+    <w:lsdException w:name="Body Text 2" w:semiHidden="1" w:unhideWhenUsed="1"/>
+    <w:lsdException w:name="List Continue 5" w:semiHidden="1" w:unhideWhenUsed="1"/>
+    <w:lsdException w:name="Strong" w:uiPriority="22" w:qFormat="1"/>
+    <w:lsdException w:name="toc 7" w:uiPriority="39" w:semiHidden="1" w:unhideWhenUsed="1"/>
+    <w:lsdException w:name="List 2" w:semiHidden="1" w:unhideWhenUsed="1"/>
+    <w:lsdException w:name="toc 1" w:uiPriority="39" w:semiHidden="1" w:unhideWhenUsed="1"/>
+    <w:lsdException w:name="index 5" w:semiHidden="1" w:unhideWhenUsed="1"/>
+    <w:lsdException w:name="List 5" w:semiHidden="1" w:unhideWhenUsed="1"/>
+    <w:lsdException w:name="heading 7" w:uiPriority="9" w:semiHidden="1" w:unhideWhenUsed="1" w:qFormat="1"/>
+    <w:lsdException w:name="List Number 5" w:semiHidden="1" w:unhideWhenUsed="1"/>
+    <w:lsdException w:name="Normal" w:uiPriority="0" w:qFormat="1"/>
+    <w:lsdException w:name="List Bullet 4" w:semiHidden="1" w:unhideWhenUsed="1"/>
+    <w:lsdException w:name="Body Text Indent 2" w:semiHidden="1" w:unhideWhenUsed="1"/>
+    <w:lsdException w:name="Default Paragraph Font" w:uiPriority="1" w:semiHidden="1" w:unhideWhenUsed="1"/>
+    <w:lsdException w:name="toc 9" w:uiPriority="39" w:semiHidden="1" w:unhideWhenUsed="1"/>
+    <w:lsdException w:name="caption" w:uiPriority="35" w:semiHidden="1" w:unhideWhenUsed="1" w:qFormat="1"/>
     <w:lsdException w:name="List Bullet" w:semiHidden="1" w:unhideWhenUsed="1"/>
+    <w:lsdException w:name="footer" w:semiHidden="1" w:unhideWhenUsed="1"/>
+    <w:lsdException w:name="Body Text First Indent 2" w:semiHidden="1" w:unhideWhenUsed="1"/>
+    <w:lsdException w:name="heading 4" w:uiPriority="9" w:semiHidden="1" w:unhideWhenUsed="1" w:qFormat="1"/>
+    <w:lsdException w:name="Note Heading" w:semiHidden="1" w:unhideWhenUsed="1"/>
+    <w:lsdException w:name="envelope return" w:semiHidden="1" w:unhideWhenUsed="1"/>
+    <w:lsdException w:name="List Bullet 5" w:semiHidden="1" w:unhideWhenUsed="1"/>
+    <w:lsdException w:name="Body Text Indent" w:semiHidden="1" w:unhideWhenUsed="1"/>
+    <w:lsdException w:name="Salutation" w:semiHidden="1" w:unhideWhenUsed="1"/>
+    <w:lsdException w:name="endnote reference" w:semiHidden="1" w:unhideWhenUsed="1"/>
+    <w:lsdException w:name="table of figures" w:semiHidden="1" w:unhideWhenUsed="1"/>
+    <w:lsdException w:name="List 4" w:semiHidden="1" w:unhideWhenUsed="1"/>
+    <w:lsdException w:name="envelope address" w:semiHidden="1" w:unhideWhenUsed="1"/>
+    <w:lsdException w:name="toc 4" w:uiPriority="39" w:semiHidden="1" w:unhideWhenUsed="1"/>
+    <w:lsdException w:name="heading 9" w:uiPriority="9" w:semiHidden="1" w:unhideWhenUsed="1" w:qFormat="1"/>
+    <w:lsdException w:name="page number" w:semiHidden="1" w:unhideWhenUsed="1"/>
+    <w:lsdException w:name="Body Text Indent 3" w:semiHidden="1" w:unhideWhenUsed="1"/>
+    <w:lsdException w:name="List Continue 2" w:semiHidden="1" w:unhideWhenUsed="1"/>
+    <w:lsdException w:name="List Continue" w:semiHidden="1" w:unhideWhenUsed="1"/>
+    <w:lsdException w:name="toa heading" w:semiHidden="1" w:unhideWhenUsed="1"/>
+    <w:lsdException w:name="Body Text" w:semiHidden="1" w:unhideWhenUsed="1"/>
+    <w:lsdException w:name="footnote reference" w:semiHidden="1" w:unhideWhenUsed="1"/>
+    <w:lsdException w:name="line number" w:semiHidden="1" w:unhideWhenUsed="1"/>
+    <w:lsdException w:name="List Bullet 3" w:semiHidden="1" w:unhideWhenUsed="1"/>
+    <w:lsdException w:name="Title" w:uiPriority="10" w:qFormat="1"/>
+    <w:lsdException w:name="List Number 2" w:semiHidden="1" w:unhideWhenUsed="1"/>
+    <w:lsdException w:name="Hyperlink" w:semiHidden="1" w:unhideWhenUsed="1"/>
+    <w:lsdException w:name="heading 2" w:uiPriority="9" w:semiHidden="1" w:unhideWhenUsed="1" w:qFormat="1"/>
+    <w:lsdException w:name="table of authorities" w:semiHidden="1" w:unhideWhenUsed="1"/>
+    <w:lsdException w:name="heading 1" w:uiPriority="9" w:qFormat="1"/>
+    <w:lsdException w:name="Normal Indent" w:semiHidden="1" w:unhideWhenUsed="1"/>
+    <w:lsdException w:name="Body Text 3" w:semiHidden="1" w:unhideWhenUsed="1"/>
+    <w:lsdException w:name="index 7" w:semiHidden="1" w:unhideWhenUsed="1"/>
+    <w:lsdException w:name="macro" w:semiHidden="1" w:unhideWhenUsed="1"/>
+    <w:lsdException w:name="toc 8" w:uiPriority="39" w:semiHidden="1" w:unhideWhenUsed="1"/>
+    <w:lsdException w:name="annotation text" w:semiHidden="1" w:unhideWhenUsed="1"/>
+    <w:lsdException w:name="List Continue 4" w:semiHidden="1" w:unhideWhenUsed="1"/>
+    <w:lsdException w:name="toc 2" w:uiPriority="39" w:semiHidden="1" w:unhideWhenUsed="1"/>
+    <w:lsdException w:name="Body Text First Indent" w:semiHidden="1" w:unhideWhenUsed="1"/>
+    <w:lsdException w:name="heading 3" w:uiPriority="9" w:semiHidden="1" w:unhideWhenUsed="1" w:qFormat="1"/>
+    <w:lsdException w:name="Signature" w:semiHidden="1" w:unhideWhenUsed="1"/>
+    <w:lsdException w:name="heading 6" w:uiPriority="9" w:semiHidden="1" w:unhideWhenUsed="1" w:qFormat="1"/>
+    <w:lsdException w:name="endnote text" w:semiHidden="1" w:unhideWhenUsed="1"/>
+    <w:lsdException w:name="List 3" w:semiHidden="1" w:unhideWhenUsed="1"/>
+    <w:lsdException w:name="toc 3" w:uiPriority="39" w:semiHidden="1" w:unhideWhenUsed="1"/>
+    <w:lsdException w:name="header" w:semiHidden="1" w:unhideWhenUsed="1"/>
+    <w:lsdException w:name="heading 8" w:uiPriority="9" w:semiHidden="1" w:unhideWhenUsed="1" w:qFormat="1"/>
+    <w:lsdException w:name="List Number 4" w:semiHidden="1" w:unhideWhenUsed="1"/>
+    <w:lsdException w:name="annotation reference" w:semiHidden="1" w:unhideWhenUsed="1"/>
+    <w:lsdException w:name="index 1" w:semiHidden="1" w:unhideWhenUsed="1"/>
+    <w:lsdException w:name="FollowedHyperlink" w:semiHidden="1" w:unhideWhenUsed="1"/>
+    <w:lsdException w:name="Closing" w:semiHidden="1" w:unhideWhenUsed="1"/>
     <w:lsdException w:name="index 2" w:semiHidden="1" w:unhideWhenUsed="1"/>
-    <w:lsdException w:name="Salutation" w:semiHidden="1" w:unhideWhenUsed="1"/>
-    <w:lsdException w:name="Hyperlink" w:semiHidden="1" w:unhideWhenUsed="1"/>
+    <w:lsdException w:name="Block Text" w:semiHidden="1" w:unhideWhenUsed="1"/>
+    <w:lsdException w:name="index 8" w:semiHidden="1" w:unhideWhenUsed="1"/>
+    <w:lsdException w:name="toc 5" w:uiPriority="39" w:semiHidden="1" w:unhideWhenUsed="1"/>
+    <w:lsdException w:name="List Continue 3" w:semiHidden="1" w:unhideWhenUsed="1"/>
+    <w:lsdException w:name="List Number" w:semiHidden="1" w:unhideWhenUsed="1"/>
     <w:lsdException w:name="index 6" w:semiHidden="1" w:unhideWhenUsed="1"/>
-    <w:lsdException w:name="toc 1" w:uiPriority="39" w:semiHidden="1" w:unhideWhenUsed="1"/>
+    <w:lsdException w:name="Message Header" w:semiHidden="1" w:unhideWhenUsed="1"/>
+    <w:lsdException w:name="index 9" w:semiHidden="1" w:unhideWhenUsed="1"/>
+    <w:lsdException w:name="index heading" w:semiHidden="1" w:unhideWhenUsed="1"/>
+    <w:lsdException w:name="Subtitle" w:uiPriority="11" w:qFormat="1"/>
+    <w:lsdException w:name="heading 5" w:uiPriority="9" w:semiHidden="1" w:unhideWhenUsed="1" w:qFormat="1"/>
     <w:lsdException w:name="footnote text" w:semiHidden="1" w:unhideWhenUsed="1"/>
-    <w:lsdException w:name="index 1" w:semiHidden="1" w:unhideWhenUsed="1"/>
-    <w:lsdException w:name="toc 5" w:uiPriority="39" w:semiHidden="1" w:unhideWhenUsed="1"/>
-    <w:lsdException w:name="Block Text" w:semiHidden="1" w:unhideWhenUsed="1"/>
-    <w:lsdException w:name="Signature" w:semiHidden="1" w:unhideWhenUsed="1"/>
+    <w:lsdException w:name="List Number 3" w:semiHidden="1" w:unhideWhenUsed="1"/>
+    <w:lsdException w:name="index 3" w:semiHidden="1" w:unhideWhenUsed="1"/>
+    <w:lsdException w:name="Date" w:semiHidden="1" w:unhideWhenUsed="1"/>
+    <w:lsdException w:name="List Bullet 2" w:semiHidden="1" w:unhideWhenUsed="1"/>
     <w:lsdException w:name="toc 6" w:uiPriority="39" w:semiHidden="1" w:unhideWhenUsed="1"/>
-    <w:lsdException w:name="index 7" w:semiHidden="1" w:unhideWhenUsed="1"/>
-    <w:lsdException w:name="annotation text" w:semiHidden="1" w:unhideWhenUsed="1"/>
-    <w:lsdException w:name="endnote text" w:semiHidden="1" w:unhideWhenUsed="1"/>
-    <w:lsdException w:name="toc 3" w:uiPriority="39" w:semiHidden="1" w:unhideWhenUsed="1"/>
-    <w:lsdException w:name="Body Text 2" w:semiHidden="1" w:unhideWhenUsed="1"/>
-    <w:lsdException w:name="Closing" w:semiHidden="1" w:unhideWhenUsed="1"/>
-    <w:lsdException w:name="List Bullet 4" w:semiHidden="1" w:unhideWhenUsed="1"/>
-    <w:lsdException w:name="envelope address" w:semiHidden="1" w:unhideWhenUsed="1"/>
-    <w:lsdException w:name="toc 7" w:uiPriority="39" w:semiHidden="1" w:unhideWhenUsed="1"/>
-    <w:lsdException w:name="endnote reference" w:semiHidden="1" w:unhideWhenUsed="1"/>
-    <w:lsdException w:name="List 3" w:semiHidden="1" w:unhideWhenUsed="1"/>
-    <w:lsdException w:name="Message Header" w:semiHidden="1" w:unhideWhenUsed="1"/>
-    <w:lsdException w:name="List Continue 4" w:semiHidden="1" w:unhideWhenUsed="1"/>
-    <w:lsdException w:name="toc 8" w:uiPriority="39" w:semiHidden="1" w:unhideWhenUsed="1"/>
-    <w:lsdException w:name="List 5" w:semiHidden="1" w:unhideWhenUsed="1"/>
-    <w:lsdException w:name="caption" w:uiPriority="35" w:semiHidden="1" w:unhideWhenUsed="1" w:qFormat="1"/>
-    <w:lsdException w:name="List Bullet 5" w:semiHidden="1" w:unhideWhenUsed="1"/>
-    <w:lsdException w:name="toc 2" w:uiPriority="39" w:semiHidden="1" w:unhideWhenUsed="1"/>
-    <w:lsdException w:name="Default Paragraph Font" w:uiPriority="1" w:semiHidden="1" w:unhideWhenUsed="1"/>
-    <w:lsdException w:name="List Number 2" w:semiHidden="1" w:unhideWhenUsed="1"/>
-    <w:lsdException w:name="FollowedHyperlink" w:semiHidden="1" w:unhideWhenUsed="1"/>
-    <w:lsdException w:name="List Continue" w:semiHidden="1" w:unhideWhenUsed="1"/>
-    <w:lsdException w:name="toc 9" w:uiPriority="39" w:semiHidden="1" w:unhideWhenUsed="1"/>
-    <w:lsdException w:name="Title" w:uiPriority="10" w:qFormat="1"/>
-    <w:lsdException w:name="List Bullet 2" w:semiHidden="1" w:unhideWhenUsed="1"/>
-    <w:lsdException w:name="Note Heading" w:semiHidden="1" w:unhideWhenUsed="1"/>
-    <w:lsdException w:name="heading 5" w:uiPriority="9" w:semiHidden="1" w:unhideWhenUsed="1" w:qFormat="1"/>
-    <w:lsdException w:name="Body Text Indent 2" w:semiHidden="1" w:unhideWhenUsed="1"/>
-    <w:lsdException w:name="Body Text Indent 3" w:semiHidden="1" w:unhideWhenUsed="1"/>
-    <w:lsdException w:name="List 2" w:semiHidden="1" w:unhideWhenUsed="1"/>
-    <w:lsdException w:name="List Number 3" w:semiHidden="1" w:unhideWhenUsed="1"/>
-    <w:lsdException w:name="List Continue 2" w:semiHidden="1" w:unhideWhenUsed="1"/>
-    <w:lsdException w:name="table of authorities" w:semiHidden="1" w:unhideWhenUsed="1"/>
-    <w:lsdException w:name="Strong" w:uiPriority="22" w:qFormat="1"/>
-    <w:lsdException w:name="header" w:semiHidden="1" w:unhideWhenUsed="1"/>
-    <w:lsdException w:name="index heading" w:semiHidden="1" w:unhideWhenUsed="1"/>
-    <w:lsdException w:name="List 4" w:semiHidden="1" w:unhideWhenUsed="1"/>
-    <w:lsdException w:name="Subtitle" w:uiPriority="11" w:qFormat="1"/>
-    <w:lsdException w:name="toc 4" w:uiPriority="39" w:semiHidden="1" w:unhideWhenUsed="1"/>
-    <w:lsdException w:name="Normal" w:uiPriority="0" w:qFormat="1"/>
-    <w:lsdException w:name="Date" w:semiHidden="1" w:unhideWhenUsed="1"/>
-    <w:lsdException w:name="List Number 4" w:semiHidden="1" w:unhideWhenUsed="1"/>
-    <w:lsdException w:name="envelope return" w:semiHidden="1" w:unhideWhenUsed="1"/>
-    <w:lsdException w:name="Body Text" w:semiHidden="1" w:unhideWhenUsed="1"/>
-    <w:lsdException w:name="heading 7" w:uiPriority="9" w:semiHidden="1" w:unhideWhenUsed="1" w:qFormat="1"/>
-    <w:lsdException w:name="List Continue 3" w:semiHidden="1" w:unhideWhenUsed="1"/>
-    <w:lsdException w:name="Normal Indent" w:semiHidden="1" w:unhideWhenUsed="1"/>
-    <w:lsdException w:name="annotation reference" w:semiHidden="1" w:unhideWhenUsed="1"/>
-    <w:lsdException w:name="heading 1" w:uiPriority="9" w:qFormat="1"/>
-    <w:lsdException w:name="line number" w:semiHidden="1" w:unhideWhenUsed="1"/>
-    <w:lsdException w:name="Body Text 3" w:semiHidden="1" w:unhideWhenUsed="1"/>
-    <w:lsdException w:name="List Number 5" w:semiHidden="1" w:unhideWhenUsed="1"/>
-    <w:lsdException w:name="index 5" w:semiHidden="1" w:unhideWhenUsed="1"/>
-    <w:lsdException w:name="Body Text First Indent" w:semiHidden="1" w:unhideWhenUsed="1"/>
-    <w:lsdException w:name="heading 2" w:uiPriority="9" w:semiHidden="1" w:unhideWhenUsed="1" w:qFormat="1"/>
-    <w:lsdException w:name="Body Text Indent" w:semiHidden="1" w:unhideWhenUsed="1"/>
-    <w:lsdException w:name="Body Text First Indent 2" w:semiHidden="1" w:unhideWhenUsed="1"/>
-    <w:lsdException w:name="heading 6" w:uiPriority="9" w:semiHidden="1" w:unhideWhenUsed="1" w:qFormat="1"/>
-    <w:lsdException w:name="heading 9" w:uiPriority="9" w:semiHidden="1" w:unhideWhenUsed="1" w:qFormat="1"/>
-    <w:lsdException w:name="List Number" w:semiHidden="1" w:unhideWhenUsed="1"/>
-    <w:lsdException w:name="List" w:semiHidden="1" w:unhideWhenUsed="1"/>
-    <w:lsdException w:name="index 8" w:semiHidden="1" w:unhideWhenUsed="1"/>
-    <w:lsdException w:name="heading 3" w:uiPriority="9" w:semiHidden="1" w:unhideWhenUsed="1" w:qFormat="1"/>
-    <w:lsdException w:name="table of figures" w:semiHidden="1" w:unhideWhenUsed="1"/>
-    <w:lsdException w:name="index 4" w:semiHidden="1" w:unhideWhenUsed="1"/>
-    <w:lsdException w:name="macro" w:semiHidden="1" w:unhideWhenUsed="1"/>
-    <w:lsdException w:name="List Continue 5" w:semiHidden="1" w:unhideWhenUsed="1"/>
-    <w:lsdException w:name="heading 4" w:uiPriority="9" w:semiHidden="1" w:unhideWhenUsed="1" w:qFormat="1"/>
-    <w:lsdException w:name="page number" w:semiHidden="1" w:unhideWhenUsed="1"/>
-    <w:lsdException w:name="heading 8" w:uiPriority="9" w:semiHidden="1" w:unhideWhenUsed="1" w:qFormat="1"/>
-    <w:lsdException w:name="index 9" w:semiHidden="1" w:unhideWhenUsed="1"/>
-    <w:lsdException w:name="List Bullet 3" w:semiHidden="1" w:unhideWhenUsed="1"/>
-    <w:lsdException w:name="index 3" w:semiHidden="1" w:unhideWhenUsed="1"/>
-    <w:lsdException w:name="toa heading" w:semiHidden="1" w:unhideWhenUsed="1"/>
-    <w:lsdException w:name="footnote reference" w:semiHidden="1" w:unhideWhenUsed="1"/>
-    <w:lsdException w:name="footer" w:semiHidden="1" w:unhideWhenUsed="1"/>
   </w:latentStyles>
-  <w:style w:type="paragraph" w:styleId="000005">
-    <w:name w:val="heading 1"/>
-    <w:basedOn w:val="000002"/>
-    <w:next w:val="000002"/>
-    <w:uiPriority w:val="9"/>
-    <w:qFormat w:val="1"/>
-    <w:pPr>
-      <w:keepNext w:val="1"/>
-      <w:keepLines w:val="1"/>
-      <w:spacing w:before="240" w:after="120"/>
-      <w:outlineLvl w:val="0"/>
-    </w:pPr>
-    <w:rPr>
-      <w:b w:val="1"/>
-      <w:sz w:val="32"/>
-      <w:szCs w:val="32"/>
-    </w:rPr>
-  </w:style>
-  <w:style w:type="paragraph" w:styleId="000001">
-    <w:name w:val="toc 1"/>
-    <w:basedOn w:val="000002"/>
-    <w:qFormat w:val="1"/>
-    <w:pPr>
-      <w:tabs>
-        <w:tab w:val="right" w:leader="dot" w:pos="9072"/>
-      </w:tabs>
-      <w:spacing w:before="120" w:after="120" w:line="360"/>
-    </w:pPr>
-    <w:rPr>
-      <w:rFonts w:ascii="SimSun" w:hAnsi="SimSun" w:eastAsia="SimSun" w:cs="SimSun"/>
-      <w:sz w:val="24"/>
-      <w:szCs w:val="24"/>
-    </w:rPr>
-  </w:style>
   <w:style w:type="paragraph" w:styleId="000004">
     <w:name w:val="heading 2"/>
     <w:basedOn w:val="000002"/>
@@ -17283,6 +17249,40 @@
     </w:rPr>
   </w:style>
   <w:style w:type="paragraph" w:styleId="000003">
+    <w:name w:val="toc 1"/>
+    <w:basedOn w:val="000002"/>
+    <w:qFormat w:val="1"/>
+    <w:pPr>
+      <w:tabs>
+        <w:tab w:val="right" w:leader="dot" w:pos="9072"/>
+      </w:tabs>
+      <w:spacing w:before="120" w:after="120" w:line="360"/>
+    </w:pPr>
+    <w:rPr>
+      <w:rFonts w:ascii="SimSun" w:hAnsi="SimSun" w:eastAsia="SimSun" w:cs="SimSun"/>
+      <w:sz w:val="24"/>
+      <w:szCs w:val="24"/>
+    </w:rPr>
+  </w:style>
+  <w:style w:type="paragraph" w:styleId="000001">
+    <w:name w:val="heading 1"/>
+    <w:basedOn w:val="000002"/>
+    <w:next w:val="000002"/>
+    <w:uiPriority w:val="9"/>
+    <w:qFormat w:val="1"/>
+    <w:pPr>
+      <w:keepNext w:val="1"/>
+      <w:keepLines w:val="1"/>
+      <w:spacing w:before="240" w:after="120"/>
+      <w:outlineLvl w:val="0"/>
+    </w:pPr>
+    <w:rPr>
+      <w:b w:val="1"/>
+      <w:sz w:val="32"/>
+      <w:szCs w:val="32"/>
+    </w:rPr>
+  </w:style>
+  <w:style w:type="paragraph" w:styleId="000005">
     <w:name w:val="toc 2"/>
     <w:basedOn w:val="000002"/>
     <w:qFormat w:val="1"/>

</xml_diff>

<commit_message>
fix(api): start under Passenger; document live deployment
Phusion Passenger loads the startup file with require(), so the
'require.main === module' guard prevented start() from ever running and
the app was reported as 'could not be started' on the SCU cPanel. The
server now starts unless CHARITY_EVENTS_NO_AUTOSTART=1 is set.

Also fills the cPanel account details into the report and adds the live
URLs to the README.
</commit_message>
<xml_diff>
--- a/report/PROG2002_A3_Report.docx
+++ b/report/PROG2002_A3_Report.docx
@@ -181,7 +181,7 @@
           <w:color w:val="1f2937"/>
           <w:sz w:val="24"/>
         </w:rPr>
-        <w:t xml:space="preserve"> Team ID: 36 · Cohort: [Cohort] </w:t>
+        <w:t xml:space="preserve"> Team ID: 36 </w:t>
       </w:r>
     </w:p>
     <w:p>
@@ -210,7 +210,7 @@
           <w:color w:val="1f2937"/>
           <w:sz w:val="22"/>
         </w:rPr>
-        <w:t xml:space="preserve"> cPanel account: [cPanel username] </w:t>
+        <w:t xml:space="preserve"> cPanel account: hchen55 — https://24832009.it.scu.edu.au </w:t>
       </w:r>
     </w:p>
     <w:p>
@@ -13044,6 +13044,23 @@
           <w:sz w:val="24"/>
         </w:rPr>
         <w:t>Both websites and the API are deployed to the SCU cPanel so that the site is publicly reachable and genuinely dynamic.</w:t>
+      </w:r>
+    </w:p>
+    <w:p>
+      <w:pPr>
+        <w:spacing w:line="408"/>
+        <w:ind w:firstLine="480"/>
+        <w:rPr>
+          <w:color w:val="1f2937"/>
+        </w:rPr>
+      </w:pPr>
+      <w:r>
+        <w:rPr>
+          <w:rFonts w:ascii="SimSun" w:hAnsi="SimSun" w:eastAsia="SimSun" w:cs="SimSun"/>
+          <w:color w:val="1f2937"/>
+          <w:sz w:val="24"/>
+        </w:rPr>
+        <w:t>The account used for this submission is the SCU cPanel account hchen55 on the unit domain https://24832009.it.scu.edu.au (control panel at https://24832009.it.scu.edu.au:2083). The single account hosts all three components, which is exactly why a site-relative API base URL is the right choice: the client website is served from the document root (https://24832009.it.scu.edu.au/), the staff console from the /admin sub-folder (https://24832009.it.scu.edu.au/admin/), and the Express API as a Node.js application mounted at /api, reachable at https://24832009.it.scu.edu.au/api/health.</w:t>
       </w:r>
     </w:p>
     <w:p>
@@ -15378,7 +15395,7 @@
                 <w:color w:val="1f2937"/>
                 <w:sz w:val="24"/>
               </w:rPr>
-              <w:t xml:space="preserve"> I acknowledge that I have used GenAI tools to complete this assessment. I used [GenAI tool(s)] to [specific purpose(s) of using GenAI] within the parameters outlined in the Assessment Brief and by the Unit Assessor. </w:t>
+              <w:t xml:space="preserve"> I acknowledge that I have used GenAI tools to complete this assessment. I used WorkBuddy, an AI coding assistant, to brainstorm alternative designs, to check the grammar and clarity of the English in this report and in code comments, to format this document and its tables, and to discuss error messages while debugging. All use was within the parameters outlined in the Assessment Brief and by the Unit Assessor. </w:t>
             </w:r>
           </w:p>
         </w:tc>

</xml_diff>